<commit_message>
docs: sync Confirmed Tables docx with live schema (ExamResults/Blocks/ClinicRecords renames, remove Notifications, fix ERD statements)
</commit_message>
<xml_diff>
--- a/Documentation/EMS Confirmed Tables and ERD Statements.docx
+++ b/Documentation/EMS Confirmed Tables and ERD Statements.docx
@@ -36,7 +36,7 @@
         <w:spacing w:after="140"/>
       </w:pPr>
       <w:r>
-        <w:t>This document lists every confirmed table for the Enrollment Management System, in the same format used for quick reference: numbered entity name, followed by its attributes with Primary Key (PK) and Foreign Key (FK) markers. All 58 relationships and their ERD cardinality statements are listed in the final section, organized by parent table.</w:t>
+        <w:t>This document lists every confirmed table for the Enrollment Management System, in the same format used for quick reference: numbered entity name, followed by its attributes with Primary Key (PK) and Foreign Key (FK) markers. All 79 relationships and their ERD cardinality statements are listed in the final section, organized by parent table.</w:t>
       </w:r>
     </w:p>
     <w:p>
@@ -1550,7 +1550,7 @@
           <w:szCs w:val="22"/>
           <w:u w:val="single"/>
         </w:rPr>
-        <w:t>requiresQualifyingExam</w:t>
+        <w:t>requiresRetentionExam</w:t>
       </w:r>
       <w:proofErr w:type="spellEnd"/>
     </w:p>
@@ -2263,7 +2263,7 @@
           <w:szCs w:val="24"/>
           <w:u w:val="single"/>
         </w:rPr>
-        <w:t>CourseExams</w:t>
+        <w:t>ExamResults</w:t>
       </w:r>
       <w:proofErr w:type="spellEnd"/>
     </w:p>
@@ -2398,6 +2398,14 @@
         <w:t>examStage</w:t>
       </w:r>
       <w:proofErr w:type="spellEnd"/>
+    </w:p>
+    <w:p>
+      <w:pPr>
+        <w:pStyle w:val="ListParagraph"/>
+      </w:pPr>
+      <w:r>
+        <w:t>examType</w:t>
+      </w:r>
     </w:p>
     <w:p>
       <w:pPr>
@@ -3862,16 +3870,15 @@
           <w:szCs w:val="22"/>
           <w:u w:val="single"/>
         </w:rPr>
-        <w:t>sectionId</w:t>
-      </w:r>
-      <w:proofErr w:type="spellEnd"/>
-      <w:r>
-        <w:rPr>
-          <w:sz w:val="22"/>
-          <w:szCs w:val="22"/>
-          <w:u w:val="single"/>
-        </w:rPr>
-        <w:t xml:space="preserve"> (FK)</w:t>
+        <w:t>blockId (FK)</w:t>
+      </w:r>
+      <w:proofErr w:type="spellEnd"/>
+      <w:r>
+        <w:rPr>
+          <w:sz w:val="22"/>
+          <w:szCs w:val="22"/>
+          <w:u w:val="single"/>
+        </w:rPr>
       </w:r>
     </w:p>
     <w:p>
@@ -4609,6 +4616,14 @@
     <w:p>
       <w:pPr>
         <w:pStyle w:val="ListParagraph"/>
+      </w:pPr>
+      <w:r>
+        <w:t>awardedBeforeEnrollment</w:t>
+      </w:r>
+    </w:p>
+    <w:p>
+      <w:pPr>
+        <w:pStyle w:val="ListParagraph"/>
         <w:numPr>
           <w:ilvl w:val="0"/>
           <w:numId w:val="2"/>
@@ -5824,35 +5839,34 @@
           <w:szCs w:val="24"/>
           <w:u w:val="single"/>
         </w:rPr>
-        <w:t>Sections</w:t>
-      </w:r>
-    </w:p>
-    <w:p>
-      <w:pPr>
-        <w:pStyle w:val="ListParagraph"/>
-        <w:numPr>
-          <w:ilvl w:val="0"/>
-          <w:numId w:val="3"/>
-        </w:numPr>
-        <w:spacing w:after="20"/>
-      </w:pPr>
-      <w:proofErr w:type="spellStart"/>
-      <w:r>
-        <w:rPr>
-          <w:sz w:val="22"/>
-          <w:szCs w:val="22"/>
-          <w:u w:val="single"/>
-        </w:rPr>
-        <w:t>sectionId</w:t>
-      </w:r>
-      <w:proofErr w:type="spellEnd"/>
-      <w:r>
-        <w:rPr>
-          <w:sz w:val="22"/>
-          <w:szCs w:val="22"/>
-          <w:u w:val="single"/>
-        </w:rPr>
-        <w:t xml:space="preserve"> (PK)</w:t>
+        <w:t>Blocks</w:t>
+      </w:r>
+    </w:p>
+    <w:p>
+      <w:pPr>
+        <w:pStyle w:val="ListParagraph"/>
+        <w:numPr>
+          <w:ilvl w:val="0"/>
+          <w:numId w:val="3"/>
+        </w:numPr>
+        <w:spacing w:after="20"/>
+      </w:pPr>
+      <w:proofErr w:type="spellStart"/>
+      <w:r>
+        <w:rPr>
+          <w:sz w:val="22"/>
+          <w:szCs w:val="22"/>
+          <w:u w:val="single"/>
+        </w:rPr>
+        <w:t>blockId (PK)</w:t>
+      </w:r>
+      <w:proofErr w:type="spellEnd"/>
+      <w:r>
+        <w:rPr>
+          <w:sz w:val="22"/>
+          <w:szCs w:val="22"/>
+          <w:u w:val="single"/>
+        </w:rPr>
       </w:r>
     </w:p>
     <w:p>
@@ -5947,7 +5961,7 @@
           <w:szCs w:val="22"/>
           <w:u w:val="single"/>
         </w:rPr>
-        <w:t>sectionName</w:t>
+        <w:t>blockName</w:t>
       </w:r>
       <w:proofErr w:type="spellEnd"/>
     </w:p>
@@ -6035,16 +6049,15 @@
           <w:szCs w:val="22"/>
           <w:u w:val="single"/>
         </w:rPr>
-        <w:t>sectionId</w:t>
-      </w:r>
-      <w:proofErr w:type="spellEnd"/>
-      <w:r>
-        <w:rPr>
-          <w:sz w:val="22"/>
-          <w:szCs w:val="22"/>
-          <w:u w:val="single"/>
-        </w:rPr>
-        <w:t xml:space="preserve"> (FK)</w:t>
+        <w:t>blockId (FK)</w:t>
+      </w:r>
+      <w:proofErr w:type="spellEnd"/>
+      <w:r>
+        <w:rPr>
+          <w:sz w:val="22"/>
+          <w:szCs w:val="22"/>
+          <w:u w:val="single"/>
+        </w:rPr>
       </w:r>
     </w:p>
     <w:p>
@@ -7188,157 +7201,6 @@
           <w:u w:val="single"/>
         </w:rPr>
         <w:t>contactNo</w:t>
-      </w:r>
-      <w:proofErr w:type="spellEnd"/>
-    </w:p>
-    <w:p>
-      <w:pPr>
-        <w:pStyle w:val="ListParagraph"/>
-        <w:numPr>
-          <w:ilvl w:val="0"/>
-          <w:numId w:val="3"/>
-        </w:numPr>
-        <w:spacing w:after="20"/>
-      </w:pPr>
-      <w:r>
-        <w:rPr>
-          <w:sz w:val="22"/>
-          <w:szCs w:val="22"/>
-          <w:u w:val="single"/>
-        </w:rPr>
-        <w:t>status</w:t>
-      </w:r>
-    </w:p>
-    <w:p>
-      <w:pPr>
-        <w:pStyle w:val="ListParagraph"/>
-        <w:numPr>
-          <w:ilvl w:val="0"/>
-          <w:numId w:val="2"/>
-        </w:numPr>
-        <w:spacing w:before="260" w:after="60"/>
-      </w:pPr>
-      <w:r>
-        <w:rPr>
-          <w:b/>
-          <w:bCs/>
-          <w:sz w:val="24"/>
-          <w:szCs w:val="24"/>
-          <w:u w:val="single"/>
-        </w:rPr>
-        <w:t>Notifications</w:t>
-      </w:r>
-    </w:p>
-    <w:p>
-      <w:pPr>
-        <w:pStyle w:val="ListParagraph"/>
-        <w:numPr>
-          <w:ilvl w:val="0"/>
-          <w:numId w:val="3"/>
-        </w:numPr>
-        <w:spacing w:after="20"/>
-      </w:pPr>
-      <w:proofErr w:type="spellStart"/>
-      <w:r>
-        <w:rPr>
-          <w:sz w:val="22"/>
-          <w:szCs w:val="22"/>
-          <w:u w:val="single"/>
-        </w:rPr>
-        <w:t>notificationId</w:t>
-      </w:r>
-      <w:proofErr w:type="spellEnd"/>
-      <w:r>
-        <w:rPr>
-          <w:sz w:val="22"/>
-          <w:szCs w:val="22"/>
-          <w:u w:val="single"/>
-        </w:rPr>
-        <w:t xml:space="preserve"> (PK)</w:t>
-      </w:r>
-    </w:p>
-    <w:p>
-      <w:pPr>
-        <w:pStyle w:val="ListParagraph"/>
-        <w:numPr>
-          <w:ilvl w:val="0"/>
-          <w:numId w:val="3"/>
-        </w:numPr>
-        <w:spacing w:after="20"/>
-      </w:pPr>
-      <w:proofErr w:type="spellStart"/>
-      <w:r>
-        <w:rPr>
-          <w:sz w:val="22"/>
-          <w:szCs w:val="22"/>
-          <w:u w:val="single"/>
-        </w:rPr>
-        <w:lastRenderedPageBreak/>
-        <w:t>studentId</w:t>
-      </w:r>
-      <w:proofErr w:type="spellEnd"/>
-      <w:r>
-        <w:rPr>
-          <w:sz w:val="22"/>
-          <w:szCs w:val="22"/>
-          <w:u w:val="single"/>
-        </w:rPr>
-        <w:t xml:space="preserve"> (FK)</w:t>
-      </w:r>
-    </w:p>
-    <w:p>
-      <w:pPr>
-        <w:pStyle w:val="ListParagraph"/>
-        <w:numPr>
-          <w:ilvl w:val="0"/>
-          <w:numId w:val="3"/>
-        </w:numPr>
-        <w:spacing w:after="20"/>
-      </w:pPr>
-      <w:r>
-        <w:rPr>
-          <w:sz w:val="22"/>
-          <w:szCs w:val="22"/>
-          <w:u w:val="single"/>
-        </w:rPr>
-        <w:t>message</w:t>
-      </w:r>
-    </w:p>
-    <w:p>
-      <w:pPr>
-        <w:pStyle w:val="ListParagraph"/>
-        <w:numPr>
-          <w:ilvl w:val="0"/>
-          <w:numId w:val="3"/>
-        </w:numPr>
-        <w:spacing w:after="20"/>
-      </w:pPr>
-      <w:r>
-        <w:rPr>
-          <w:sz w:val="22"/>
-          <w:szCs w:val="22"/>
-          <w:u w:val="single"/>
-        </w:rPr>
-        <w:t>channel</w:t>
-      </w:r>
-    </w:p>
-    <w:p>
-      <w:pPr>
-        <w:pStyle w:val="ListParagraph"/>
-        <w:numPr>
-          <w:ilvl w:val="0"/>
-          <w:numId w:val="3"/>
-        </w:numPr>
-        <w:spacing w:after="20"/>
-      </w:pPr>
-      <w:proofErr w:type="spellStart"/>
-      <w:r>
-        <w:rPr>
-          <w:sz w:val="22"/>
-          <w:szCs w:val="22"/>
-          <w:u w:val="single"/>
-        </w:rPr>
-        <w:t>sentDate</w:t>
       </w:r>
       <w:proofErr w:type="spellEnd"/>
     </w:p>
@@ -7887,6 +7749,110 @@
     </w:p>
     <w:p>
       <w:pPr>
+        <w:pStyle w:val="ListParagraph"/>
+      </w:pPr>
+      <w:r>
+        <w:t>clinicRecordId (PK)</w:t>
+      </w:r>
+    </w:p>
+    <w:p>
+      <w:pPr>
+        <w:pStyle w:val="ListParagraph"/>
+      </w:pPr>
+      <w:r>
+        <w:t>enrollmentId (FK)</w:t>
+      </w:r>
+    </w:p>
+    <w:p>
+      <w:pPr>
+        <w:pStyle w:val="ListParagraph"/>
+      </w:pPr>
+      <w:r>
+        <w:t>heightCm</w:t>
+      </w:r>
+    </w:p>
+    <w:p>
+      <w:pPr>
+        <w:pStyle w:val="ListParagraph"/>
+      </w:pPr>
+      <w:r>
+        <w:t>weightKg</w:t>
+      </w:r>
+    </w:p>
+    <w:p>
+      <w:pPr>
+        <w:pStyle w:val="ListParagraph"/>
+      </w:pPr>
+      <w:r>
+        <w:t>bloodPressure</w:t>
+      </w:r>
+    </w:p>
+    <w:p>
+      <w:pPr>
+        <w:pStyle w:val="ListParagraph"/>
+      </w:pPr>
+      <w:r>
+        <w:t>philhealthNumber</w:t>
+      </w:r>
+    </w:p>
+    <w:p>
+      <w:pPr>
+        <w:pStyle w:val="ListParagraph"/>
+      </w:pPr>
+      <w:r>
+        <w:t>philhealthRegistered</w:t>
+      </w:r>
+    </w:p>
+    <w:p>
+      <w:pPr>
+        <w:pStyle w:val="ListParagraph"/>
+      </w:pPr>
+      <w:r>
+        <w:t>assessmentNotes</w:t>
+      </w:r>
+    </w:p>
+    <w:p>
+      <w:pPr>
+        <w:pStyle w:val="ListParagraph"/>
+      </w:pPr>
+      <w:r>
+        <w:t>findings</w:t>
+      </w:r>
+    </w:p>
+    <w:p>
+      <w:pPr>
+        <w:pStyle w:val="ListParagraph"/>
+      </w:pPr>
+      <w:r>
+        <w:t>clinicStaffId (FK)</w:t>
+      </w:r>
+    </w:p>
+    <w:p>
+      <w:pPr>
+        <w:pStyle w:val="ListParagraph"/>
+      </w:pPr>
+      <w:r>
+        <w:t>assessmentDate</w:t>
+      </w:r>
+    </w:p>
+    <w:p>
+      <w:pPr>
+        <w:pStyle w:val="ListParagraph"/>
+      </w:pPr>
+      <w:r>
+        <w:t>status</w:t>
+      </w:r>
+    </w:p>
+    <w:p>
+      <w:pPr>
+        <w:pStyle w:val="ListParagraph"/>
+      </w:pPr>
+      <w:r>
+        <w:t>ClinicRecords</w:t>
+      </w:r>
+    </w:p>
+    <w:p>
+      <w:pPr>
         <w:pStyle w:val="Heading3"/>
         <w:spacing w:before="220" w:after="80"/>
       </w:pPr>
@@ -7983,11 +7949,78 @@
         <w:spacing w:after="100"/>
       </w:pPr>
       <w:r>
+        <w:t>One Students record can have one or many ExamResults records; each ExamResults record must belong to exactly one Students record (via ExamResults.studentId).</w:t>
+      </w:r>
+      <w:proofErr w:type="spellStart"/>
+      <w:r/>
+      <w:proofErr w:type="spellEnd"/>
+      <w:r/>
+      <w:proofErr w:type="spellStart"/>
+      <w:r/>
+      <w:proofErr w:type="spellEnd"/>
+      <w:r/>
+      <w:proofErr w:type="spellStart"/>
+      <w:r/>
+      <w:proofErr w:type="spellEnd"/>
+      <w:r/>
+    </w:p>
+    <w:p>
+      <w:pPr>
+        <w:pStyle w:val="ListParagraph"/>
+        <w:numPr>
+          <w:ilvl w:val="0"/>
+          <w:numId w:val="4"/>
+        </w:numPr>
+        <w:spacing w:after="100"/>
+      </w:pPr>
+      <w:r>
+        <w:t xml:space="preserve">One Students record can have one or many Admissions records; each Admissions record must belong to exactly one Students record (via </w:t>
+      </w:r>
+      <w:proofErr w:type="spellStart"/>
+      <w:r>
+        <w:t>Admissions.studentId</w:t>
+      </w:r>
+      <w:proofErr w:type="spellEnd"/>
+      <w:r>
+        <w:t>).</w:t>
+      </w:r>
+    </w:p>
+    <w:p>
+      <w:pPr>
+        <w:pStyle w:val="ListParagraph"/>
+        <w:numPr>
+          <w:ilvl w:val="0"/>
+          <w:numId w:val="4"/>
+        </w:numPr>
+        <w:spacing w:after="100"/>
+      </w:pPr>
+      <w:r>
+        <w:t xml:space="preserve">One Students record can have one or many Enrollments records; each Enrollments record must belong to exactly one Students record (via </w:t>
+      </w:r>
+      <w:proofErr w:type="spellStart"/>
+      <w:r>
+        <w:t>Enrollments.studentId</w:t>
+      </w:r>
+      <w:proofErr w:type="spellEnd"/>
+      <w:r>
+        <w:t>).</w:t>
+      </w:r>
+    </w:p>
+    <w:p>
+      <w:pPr>
+        <w:pStyle w:val="ListParagraph"/>
+        <w:numPr>
+          <w:ilvl w:val="0"/>
+          <w:numId w:val="4"/>
+        </w:numPr>
+        <w:spacing w:after="100"/>
+      </w:pPr>
+      <w:r>
         <w:t xml:space="preserve">One Students record can have one or many </w:t>
       </w:r>
       <w:proofErr w:type="spellStart"/>
       <w:r>
-        <w:t>CourseExams</w:t>
+        <w:t>TransferAcademicRecords</w:t>
       </w:r>
       <w:proofErr w:type="spellEnd"/>
       <w:r>
@@ -7995,7 +8028,7 @@
       </w:r>
       <w:proofErr w:type="spellStart"/>
       <w:r>
-        <w:t>CourseExams</w:t>
+        <w:t>TransferAcademicRecords</w:t>
       </w:r>
       <w:proofErr w:type="spellEnd"/>
       <w:r>
@@ -8003,7 +8036,7 @@
       </w:r>
       <w:proofErr w:type="spellStart"/>
       <w:r>
-        <w:t>CourseExams.studentId</w:t>
+        <w:t>TransferAcademicRecords.studentId</w:t>
       </w:r>
       <w:proofErr w:type="spellEnd"/>
       <w:r>
@@ -8020,11 +8053,27 @@
         <w:spacing w:after="100"/>
       </w:pPr>
       <w:r>
-        <w:t xml:space="preserve">One Students record can have one or many Admissions records; each Admissions record must belong to exactly one Students record (via </w:t>
-      </w:r>
-      <w:proofErr w:type="spellStart"/>
-      <w:r>
-        <w:t>Admissions.studentId</w:t>
+        <w:t xml:space="preserve">One Students record can have one or many </w:t>
+      </w:r>
+      <w:proofErr w:type="spellStart"/>
+      <w:r>
+        <w:t>StudentScholarships</w:t>
+      </w:r>
+      <w:proofErr w:type="spellEnd"/>
+      <w:r>
+        <w:t xml:space="preserve"> records; each </w:t>
+      </w:r>
+      <w:proofErr w:type="spellStart"/>
+      <w:r>
+        <w:t>StudentScholarships</w:t>
+      </w:r>
+      <w:proofErr w:type="spellEnd"/>
+      <w:r>
+        <w:t xml:space="preserve"> record must belong to exactly one Students record (via </w:t>
+      </w:r>
+      <w:proofErr w:type="spellStart"/>
+      <w:r>
+        <w:t>StudentScholarships.studentId</w:t>
       </w:r>
       <w:proofErr w:type="spellEnd"/>
       <w:r>
@@ -8041,11 +8090,27 @@
         <w:spacing w:after="100"/>
       </w:pPr>
       <w:r>
-        <w:t xml:space="preserve">One Students record can have one or many Enrollments records; each Enrollments record must belong to exactly one Students record (via </w:t>
-      </w:r>
-      <w:proofErr w:type="spellStart"/>
-      <w:r>
-        <w:t>Enrollments.studentId</w:t>
+        <w:t xml:space="preserve">One Students record can have one or many </w:t>
+      </w:r>
+      <w:proofErr w:type="spellStart"/>
+      <w:r>
+        <w:t>StudentClearances</w:t>
+      </w:r>
+      <w:proofErr w:type="spellEnd"/>
+      <w:r>
+        <w:t xml:space="preserve"> records; each </w:t>
+      </w:r>
+      <w:proofErr w:type="spellStart"/>
+      <w:r>
+        <w:t>StudentClearances</w:t>
+      </w:r>
+      <w:proofErr w:type="spellEnd"/>
+      <w:r>
+        <w:t xml:space="preserve"> record must belong to exactly one Students record (via </w:t>
+      </w:r>
+      <w:proofErr w:type="spellStart"/>
+      <w:r>
+        <w:t>StudentClearances.studentId</w:t>
       </w:r>
       <w:proofErr w:type="spellEnd"/>
       <w:r>
@@ -8066,7 +8131,7 @@
       </w:r>
       <w:proofErr w:type="spellStart"/>
       <w:r>
-        <w:t>TransferAcademicRecords</w:t>
+        <w:t>StudentIds</w:t>
       </w:r>
       <w:proofErr w:type="spellEnd"/>
       <w:r>
@@ -8074,7 +8139,7 @@
       </w:r>
       <w:proofErr w:type="spellStart"/>
       <w:r>
-        <w:t>TransferAcademicRecords</w:t>
+        <w:t>StudentIds</w:t>
       </w:r>
       <w:proofErr w:type="spellEnd"/>
       <w:r>
@@ -8082,139 +8147,7 @@
       </w:r>
       <w:proofErr w:type="spellStart"/>
       <w:r>
-        <w:t>TransferAcademicRecords.studentId</w:t>
-      </w:r>
-      <w:proofErr w:type="spellEnd"/>
-      <w:r>
-        <w:t>).</w:t>
-      </w:r>
-    </w:p>
-    <w:p>
-      <w:pPr>
-        <w:pStyle w:val="ListParagraph"/>
-        <w:numPr>
-          <w:ilvl w:val="0"/>
-          <w:numId w:val="4"/>
-        </w:numPr>
-        <w:spacing w:after="100"/>
-      </w:pPr>
-      <w:r>
-        <w:t xml:space="preserve">One Students record can have one or many </w:t>
-      </w:r>
-      <w:proofErr w:type="spellStart"/>
-      <w:r>
-        <w:t>StudentScholarships</w:t>
-      </w:r>
-      <w:proofErr w:type="spellEnd"/>
-      <w:r>
-        <w:t xml:space="preserve"> records; each </w:t>
-      </w:r>
-      <w:proofErr w:type="spellStart"/>
-      <w:r>
-        <w:t>StudentScholarships</w:t>
-      </w:r>
-      <w:proofErr w:type="spellEnd"/>
-      <w:r>
-        <w:t xml:space="preserve"> record must belong to exactly one Students record (via </w:t>
-      </w:r>
-      <w:proofErr w:type="spellStart"/>
-      <w:r>
-        <w:t>StudentScholarships.studentId</w:t>
-      </w:r>
-      <w:proofErr w:type="spellEnd"/>
-      <w:r>
-        <w:t>).</w:t>
-      </w:r>
-    </w:p>
-    <w:p>
-      <w:pPr>
-        <w:pStyle w:val="ListParagraph"/>
-        <w:numPr>
-          <w:ilvl w:val="0"/>
-          <w:numId w:val="4"/>
-        </w:numPr>
-        <w:spacing w:after="100"/>
-      </w:pPr>
-      <w:r>
-        <w:t xml:space="preserve">One Students record can have one or many </w:t>
-      </w:r>
-      <w:proofErr w:type="spellStart"/>
-      <w:r>
-        <w:t>StudentClearances</w:t>
-      </w:r>
-      <w:proofErr w:type="spellEnd"/>
-      <w:r>
-        <w:t xml:space="preserve"> records; each </w:t>
-      </w:r>
-      <w:proofErr w:type="spellStart"/>
-      <w:r>
-        <w:t>StudentClearances</w:t>
-      </w:r>
-      <w:proofErr w:type="spellEnd"/>
-      <w:r>
-        <w:t xml:space="preserve"> record must belong to exactly one Students record (via </w:t>
-      </w:r>
-      <w:proofErr w:type="spellStart"/>
-      <w:r>
-        <w:t>StudentClearances.studentId</w:t>
-      </w:r>
-      <w:proofErr w:type="spellEnd"/>
-      <w:r>
-        <w:t>).</w:t>
-      </w:r>
-    </w:p>
-    <w:p>
-      <w:pPr>
-        <w:pStyle w:val="ListParagraph"/>
-        <w:numPr>
-          <w:ilvl w:val="0"/>
-          <w:numId w:val="4"/>
-        </w:numPr>
-        <w:spacing w:after="100"/>
-      </w:pPr>
-      <w:r>
-        <w:t xml:space="preserve">One Students record can have one or many </w:t>
-      </w:r>
-      <w:proofErr w:type="spellStart"/>
-      <w:r>
-        <w:t>StudentIds</w:t>
-      </w:r>
-      <w:proofErr w:type="spellEnd"/>
-      <w:r>
-        <w:t xml:space="preserve"> records; each </w:t>
-      </w:r>
-      <w:proofErr w:type="spellStart"/>
-      <w:r>
-        <w:t>StudentIds</w:t>
-      </w:r>
-      <w:proofErr w:type="spellEnd"/>
-      <w:r>
-        <w:t xml:space="preserve"> record must belong to exactly one Students record (via </w:t>
-      </w:r>
-      <w:proofErr w:type="spellStart"/>
-      <w:r>
         <w:t>StudentIds.studentId</w:t>
-      </w:r>
-      <w:proofErr w:type="spellEnd"/>
-      <w:r>
-        <w:t>).</w:t>
-      </w:r>
-    </w:p>
-    <w:p>
-      <w:pPr>
-        <w:pStyle w:val="ListParagraph"/>
-        <w:numPr>
-          <w:ilvl w:val="0"/>
-          <w:numId w:val="4"/>
-        </w:numPr>
-        <w:spacing w:after="100"/>
-      </w:pPr>
-      <w:r>
-        <w:t xml:space="preserve">One Students record can have one or many Notifications records; each Notifications record must belong to exactly one Students record (via </w:t>
-      </w:r>
-      <w:proofErr w:type="spellStart"/>
-      <w:r>
-        <w:t>Notifications.studentId</w:t>
       </w:r>
       <w:proofErr w:type="spellEnd"/>
       <w:r>
@@ -8584,27 +8517,36 @@
         <w:spacing w:after="100"/>
       </w:pPr>
       <w:r>
-        <w:t xml:space="preserve">One Courses record can have one or many </w:t>
-      </w:r>
-      <w:proofErr w:type="spellStart"/>
-      <w:r>
-        <w:t>CourseExams</w:t>
-      </w:r>
-      <w:proofErr w:type="spellEnd"/>
-      <w:r>
-        <w:t xml:space="preserve"> records; each </w:t>
-      </w:r>
-      <w:proofErr w:type="spellStart"/>
-      <w:r>
-        <w:t>CourseExams</w:t>
-      </w:r>
-      <w:proofErr w:type="spellEnd"/>
-      <w:r>
-        <w:t xml:space="preserve"> record must belong to exactly one Courses record (via </w:t>
-      </w:r>
-      <w:proofErr w:type="spellStart"/>
-      <w:r>
-        <w:t>CourseExams.courseId</w:t>
+        <w:t>One Courses record can have one or many ExamResults records; each ExamResults record must belong to exactly one Courses record (via ExamResults.courseId).</w:t>
+      </w:r>
+      <w:proofErr w:type="spellStart"/>
+      <w:r/>
+      <w:proofErr w:type="spellEnd"/>
+      <w:r/>
+      <w:proofErr w:type="spellStart"/>
+      <w:r/>
+      <w:proofErr w:type="spellEnd"/>
+      <w:r/>
+      <w:proofErr w:type="spellStart"/>
+      <w:r/>
+      <w:proofErr w:type="spellEnd"/>
+      <w:r/>
+    </w:p>
+    <w:p>
+      <w:pPr>
+        <w:pStyle w:val="ListParagraph"/>
+        <w:numPr>
+          <w:ilvl w:val="0"/>
+          <w:numId w:val="4"/>
+        </w:numPr>
+        <w:spacing w:after="100"/>
+      </w:pPr>
+      <w:r>
+        <w:t xml:space="preserve">One Courses record can have one or many Admissions records; each Admissions record must belong to exactly one Courses record (via </w:t>
+      </w:r>
+      <w:proofErr w:type="spellStart"/>
+      <w:r>
+        <w:t>Admissions.courseId</w:t>
       </w:r>
       <w:proofErr w:type="spellEnd"/>
       <w:r>
@@ -8621,11 +8563,11 @@
         <w:spacing w:after="100"/>
       </w:pPr>
       <w:r>
-        <w:t xml:space="preserve">One Courses record can have one or many Admissions records; each Admissions record must belong to exactly one Courses record (via </w:t>
-      </w:r>
-      <w:proofErr w:type="spellStart"/>
-      <w:r>
-        <w:t>Admissions.courseId</w:t>
+        <w:t xml:space="preserve">One Courses record can have one or many Enrollments records; each Enrollments record must belong to exactly one Courses record (via </w:t>
+      </w:r>
+      <w:proofErr w:type="spellStart"/>
+      <w:r>
+        <w:t>Enrollments.courseId</w:t>
       </w:r>
       <w:proofErr w:type="spellEnd"/>
       <w:r>
@@ -8642,37 +8584,12 @@
         <w:spacing w:after="100"/>
       </w:pPr>
       <w:r>
-        <w:t xml:space="preserve">One Courses record can have one or many Enrollments records; each Enrollments record must belong to exactly one Courses record (via </w:t>
-      </w:r>
-      <w:proofErr w:type="spellStart"/>
-      <w:r>
-        <w:t>Enrollments.courseId</w:t>
-      </w:r>
-      <w:proofErr w:type="spellEnd"/>
-      <w:r>
-        <w:t>).</w:t>
-      </w:r>
-    </w:p>
-    <w:p>
-      <w:pPr>
-        <w:pStyle w:val="ListParagraph"/>
-        <w:numPr>
-          <w:ilvl w:val="0"/>
-          <w:numId w:val="4"/>
-        </w:numPr>
-        <w:spacing w:after="100"/>
-      </w:pPr>
-      <w:r>
-        <w:t xml:space="preserve">One Courses record can have one or many Sections records; each Sections record must belong to exactly one Courses record (via </w:t>
-      </w:r>
-      <w:proofErr w:type="spellStart"/>
-      <w:r>
-        <w:t>Sections.courseId</w:t>
-      </w:r>
-      <w:proofErr w:type="spellEnd"/>
-      <w:r>
-        <w:t>).</w:t>
-      </w:r>
+        <w:t>One Courses record can have one or many Blocks records; each Blocks record must belong to exactly one Courses record (via Blocks.courseId).</w:t>
+      </w:r>
+      <w:proofErr w:type="spellStart"/>
+      <w:r/>
+      <w:proofErr w:type="spellEnd"/>
+      <w:r/>
     </w:p>
     <w:p>
       <w:pPr>
@@ -9147,6 +9064,39 @@
         <w:spacing w:after="100"/>
       </w:pPr>
       <w:r>
+        <w:t>One AcademicTerms record can have one or many ExamResults records; each ExamResults record must belong to exactly one AcademicTerms record (via ExamResults.termId).</w:t>
+      </w:r>
+      <w:proofErr w:type="spellStart"/>
+      <w:r/>
+      <w:proofErr w:type="spellEnd"/>
+      <w:r/>
+      <w:proofErr w:type="spellStart"/>
+      <w:r/>
+      <w:proofErr w:type="spellEnd"/>
+      <w:r/>
+      <w:proofErr w:type="spellStart"/>
+      <w:r/>
+      <w:proofErr w:type="spellEnd"/>
+      <w:r/>
+      <w:proofErr w:type="spellStart"/>
+      <w:r/>
+      <w:proofErr w:type="spellEnd"/>
+      <w:r/>
+      <w:proofErr w:type="spellStart"/>
+      <w:r/>
+      <w:proofErr w:type="spellEnd"/>
+      <w:r/>
+    </w:p>
+    <w:p>
+      <w:pPr>
+        <w:pStyle w:val="ListParagraph"/>
+        <w:numPr>
+          <w:ilvl w:val="0"/>
+          <w:numId w:val="4"/>
+        </w:numPr>
+        <w:spacing w:after="100"/>
+      </w:pPr>
+      <w:r>
         <w:t xml:space="preserve">One </w:t>
       </w:r>
       <w:proofErr w:type="spellStart"/>
@@ -9155,11 +9105,85 @@
       </w:r>
       <w:proofErr w:type="spellEnd"/>
       <w:r>
+        <w:t xml:space="preserve"> record can have one or many Admissions records; each Admissions record must belong to exactly one </w:t>
+      </w:r>
+      <w:proofErr w:type="spellStart"/>
+      <w:r>
+        <w:t>AcademicTerms</w:t>
+      </w:r>
+      <w:proofErr w:type="spellEnd"/>
+      <w:r>
+        <w:t xml:space="preserve"> record (via </w:t>
+      </w:r>
+      <w:proofErr w:type="spellStart"/>
+      <w:r>
+        <w:t>Admissions.termId</w:t>
+      </w:r>
+      <w:proofErr w:type="spellEnd"/>
+      <w:r>
+        <w:t>).</w:t>
+      </w:r>
+    </w:p>
+    <w:p>
+      <w:pPr>
+        <w:pStyle w:val="ListParagraph"/>
+        <w:numPr>
+          <w:ilvl w:val="0"/>
+          <w:numId w:val="4"/>
+        </w:numPr>
+        <w:spacing w:after="100"/>
+      </w:pPr>
+      <w:r>
+        <w:t xml:space="preserve">One </w:t>
+      </w:r>
+      <w:proofErr w:type="spellStart"/>
+      <w:r>
+        <w:t>AcademicTerms</w:t>
+      </w:r>
+      <w:proofErr w:type="spellEnd"/>
+      <w:r>
+        <w:t xml:space="preserve"> record can have one or many Enrollments records; each Enrollments record must belong to exactly one </w:t>
+      </w:r>
+      <w:proofErr w:type="spellStart"/>
+      <w:r>
+        <w:t>AcademicTerms</w:t>
+      </w:r>
+      <w:proofErr w:type="spellEnd"/>
+      <w:r>
+        <w:t xml:space="preserve"> record (via </w:t>
+      </w:r>
+      <w:proofErr w:type="spellStart"/>
+      <w:r>
+        <w:t>Enrollments.termId</w:t>
+      </w:r>
+      <w:proofErr w:type="spellEnd"/>
+      <w:r>
+        <w:t>).</w:t>
+      </w:r>
+    </w:p>
+    <w:p>
+      <w:pPr>
+        <w:pStyle w:val="ListParagraph"/>
+        <w:numPr>
+          <w:ilvl w:val="0"/>
+          <w:numId w:val="4"/>
+        </w:numPr>
+        <w:spacing w:after="100"/>
+      </w:pPr>
+      <w:r>
+        <w:t xml:space="preserve">One </w:t>
+      </w:r>
+      <w:proofErr w:type="spellStart"/>
+      <w:r>
+        <w:t>AcademicTerms</w:t>
+      </w:r>
+      <w:proofErr w:type="spellEnd"/>
+      <w:r>
         <w:t xml:space="preserve"> record can have one or many </w:t>
       </w:r>
       <w:proofErr w:type="spellStart"/>
       <w:r>
-        <w:t>CourseExams</w:t>
+        <w:t>StudentScholarships</w:t>
       </w:r>
       <w:proofErr w:type="spellEnd"/>
       <w:r>
@@ -9167,7 +9191,7 @@
       </w:r>
       <w:proofErr w:type="spellStart"/>
       <w:r>
-        <w:t>CourseExams</w:t>
+        <w:t>StudentScholarships</w:t>
       </w:r>
       <w:proofErr w:type="spellEnd"/>
       <w:r>
@@ -9183,7 +9207,7 @@
       </w:r>
       <w:proofErr w:type="spellStart"/>
       <w:r>
-        <w:t>CourseExams.termId</w:t>
+        <w:t>StudentScholarships.termId</w:t>
       </w:r>
       <w:proofErr w:type="spellEnd"/>
       <w:r>
@@ -9208,7 +9232,23 @@
       </w:r>
       <w:proofErr w:type="spellEnd"/>
       <w:r>
-        <w:t xml:space="preserve"> record can have one or many Admissions records; each Admissions record must belong to exactly one </w:t>
+        <w:t xml:space="preserve"> record can have one or many </w:t>
+      </w:r>
+      <w:proofErr w:type="spellStart"/>
+      <w:r>
+        <w:t>ClearancePeriods</w:t>
+      </w:r>
+      <w:proofErr w:type="spellEnd"/>
+      <w:r>
+        <w:t xml:space="preserve"> records; each </w:t>
+      </w:r>
+      <w:proofErr w:type="spellStart"/>
+      <w:r>
+        <w:t>ClearancePeriods</w:t>
+      </w:r>
+      <w:proofErr w:type="spellEnd"/>
+      <w:r>
+        <w:t xml:space="preserve"> record must belong to exactly one </w:t>
       </w:r>
       <w:proofErr w:type="spellStart"/>
       <w:r>
@@ -9220,7 +9260,7 @@
       </w:r>
       <w:proofErr w:type="spellStart"/>
       <w:r>
-        <w:t>Admissions.termId</w:t>
+        <w:t>ClearancePeriods.termId</w:t>
       </w:r>
       <w:proofErr w:type="spellEnd"/>
       <w:r>
@@ -9237,175 +9277,20 @@
         <w:spacing w:after="100"/>
       </w:pPr>
       <w:r>
-        <w:t xml:space="preserve">One </w:t>
-      </w:r>
-      <w:proofErr w:type="spellStart"/>
-      <w:r>
-        <w:t>AcademicTerms</w:t>
-      </w:r>
-      <w:proofErr w:type="spellEnd"/>
-      <w:r>
-        <w:t xml:space="preserve"> record can have one or many Enrollments records; each Enrollments record must belong to exactly one </w:t>
-      </w:r>
-      <w:proofErr w:type="spellStart"/>
-      <w:r>
-        <w:t>AcademicTerms</w:t>
-      </w:r>
-      <w:proofErr w:type="spellEnd"/>
-      <w:r>
-        <w:t xml:space="preserve"> record (via </w:t>
-      </w:r>
-      <w:proofErr w:type="spellStart"/>
-      <w:r>
-        <w:t>Enrollments.termId</w:t>
-      </w:r>
-      <w:proofErr w:type="spellEnd"/>
-      <w:r>
-        <w:t>).</w:t>
-      </w:r>
-    </w:p>
-    <w:p>
-      <w:pPr>
-        <w:pStyle w:val="ListParagraph"/>
-        <w:numPr>
-          <w:ilvl w:val="0"/>
-          <w:numId w:val="4"/>
-        </w:numPr>
-        <w:spacing w:after="100"/>
-      </w:pPr>
-      <w:r>
-        <w:t xml:space="preserve">One </w:t>
-      </w:r>
-      <w:proofErr w:type="spellStart"/>
-      <w:r>
-        <w:t>AcademicTerms</w:t>
-      </w:r>
-      <w:proofErr w:type="spellEnd"/>
-      <w:r>
-        <w:t xml:space="preserve"> record can have one or many </w:t>
-      </w:r>
-      <w:proofErr w:type="spellStart"/>
-      <w:r>
-        <w:t>StudentScholarships</w:t>
-      </w:r>
-      <w:proofErr w:type="spellEnd"/>
-      <w:r>
-        <w:t xml:space="preserve"> records; each </w:t>
-      </w:r>
-      <w:proofErr w:type="spellStart"/>
-      <w:r>
-        <w:t>StudentScholarships</w:t>
-      </w:r>
-      <w:proofErr w:type="spellEnd"/>
-      <w:r>
-        <w:t xml:space="preserve"> record must belong to exactly one </w:t>
-      </w:r>
-      <w:proofErr w:type="spellStart"/>
-      <w:r>
-        <w:t>AcademicTerms</w:t>
-      </w:r>
-      <w:proofErr w:type="spellEnd"/>
-      <w:r>
-        <w:t xml:space="preserve"> record (via </w:t>
-      </w:r>
-      <w:proofErr w:type="spellStart"/>
-      <w:r>
-        <w:t>StudentScholarships.termId</w:t>
-      </w:r>
-      <w:proofErr w:type="spellEnd"/>
-      <w:r>
-        <w:t>).</w:t>
-      </w:r>
-    </w:p>
-    <w:p>
-      <w:pPr>
-        <w:pStyle w:val="ListParagraph"/>
-        <w:numPr>
-          <w:ilvl w:val="0"/>
-          <w:numId w:val="4"/>
-        </w:numPr>
-        <w:spacing w:after="100"/>
-      </w:pPr>
-      <w:r>
-        <w:t xml:space="preserve">One </w:t>
-      </w:r>
-      <w:proofErr w:type="spellStart"/>
-      <w:r>
-        <w:t>AcademicTerms</w:t>
-      </w:r>
-      <w:proofErr w:type="spellEnd"/>
-      <w:r>
-        <w:t xml:space="preserve"> record can have one or many </w:t>
-      </w:r>
-      <w:proofErr w:type="spellStart"/>
-      <w:r>
-        <w:t>ClearancePeriods</w:t>
-      </w:r>
-      <w:proofErr w:type="spellEnd"/>
-      <w:r>
-        <w:t xml:space="preserve"> records; each </w:t>
-      </w:r>
-      <w:proofErr w:type="spellStart"/>
-      <w:r>
-        <w:t>ClearancePeriods</w:t>
-      </w:r>
-      <w:proofErr w:type="spellEnd"/>
-      <w:r>
-        <w:t xml:space="preserve"> record must belong to exactly one </w:t>
-      </w:r>
-      <w:proofErr w:type="spellStart"/>
-      <w:r>
-        <w:t>AcademicTerms</w:t>
-      </w:r>
-      <w:proofErr w:type="spellEnd"/>
-      <w:r>
-        <w:t xml:space="preserve"> record (via </w:t>
-      </w:r>
-      <w:proofErr w:type="spellStart"/>
-      <w:r>
-        <w:t>ClearancePeriods.termId</w:t>
-      </w:r>
-      <w:proofErr w:type="spellEnd"/>
-      <w:r>
-        <w:t>).</w:t>
-      </w:r>
-    </w:p>
-    <w:p>
-      <w:pPr>
-        <w:pStyle w:val="ListParagraph"/>
-        <w:numPr>
-          <w:ilvl w:val="0"/>
-          <w:numId w:val="4"/>
-        </w:numPr>
-        <w:spacing w:after="100"/>
-      </w:pPr>
-      <w:r>
-        <w:t xml:space="preserve">One </w:t>
-      </w:r>
-      <w:proofErr w:type="spellStart"/>
-      <w:r>
-        <w:t>AcademicTerms</w:t>
-      </w:r>
-      <w:proofErr w:type="spellEnd"/>
-      <w:r>
-        <w:t xml:space="preserve"> record can have one or many Sections records; each Sections record must belong to exactly one </w:t>
-      </w:r>
-      <w:proofErr w:type="spellStart"/>
-      <w:r>
-        <w:t>AcademicTerms</w:t>
-      </w:r>
-      <w:proofErr w:type="spellEnd"/>
-      <w:r>
-        <w:t xml:space="preserve"> record (via </w:t>
-      </w:r>
-      <w:proofErr w:type="spellStart"/>
-      <w:r>
-        <w:t>Sections.termId</w:t>
-      </w:r>
-      <w:proofErr w:type="spellEnd"/>
-      <w:r>
-        <w:t>).</w:t>
-      </w:r>
+        <w:t>One AcademicTerms record can have one or many Blocks records; each Blocks record must belong to exactly one AcademicTerms record (via Blocks.termId).</w:t>
+      </w:r>
+      <w:proofErr w:type="spellStart"/>
+      <w:r/>
+      <w:proofErr w:type="spellEnd"/>
+      <w:r/>
+      <w:proofErr w:type="spellStart"/>
+      <w:r/>
+      <w:proofErr w:type="spellEnd"/>
+      <w:r/>
+      <w:proofErr w:type="spellStart"/>
+      <w:r/>
+      <w:proofErr w:type="spellEnd"/>
+      <w:r/>
     </w:p>
     <w:p>
       <w:pPr>
@@ -9729,6 +9614,14 @@
     </w:p>
     <w:p>
       <w:pPr>
+        <w:pStyle w:val="ListParagraph"/>
+      </w:pPr>
+      <w:r>
+        <w:t>One Enrollments record can have one or many ClinicRecords records; each ClinicRecords record must belong to exactly one Enrollments record.</w:t>
+      </w:r>
+    </w:p>
+    <w:p>
+      <w:pPr>
         <w:pStyle w:val="Heading3"/>
         <w:spacing w:before="220" w:after="80"/>
       </w:pPr>
@@ -10149,7 +10042,7 @@
         <w:spacing w:before="220" w:after="80"/>
       </w:pPr>
       <w:r>
-        <w:t>Sections</w:t>
+        <w:t>Blocks</w:t>
       </w:r>
     </w:p>
     <w:p>
@@ -10162,33 +10055,20 @@
         <w:spacing w:after="100"/>
       </w:pPr>
       <w:r>
-        <w:lastRenderedPageBreak/>
-        <w:t xml:space="preserve">One Sections record can have one or many </w:t>
-      </w:r>
-      <w:proofErr w:type="spellStart"/>
-      <w:r>
-        <w:t>EnrolledSubjects</w:t>
-      </w:r>
-      <w:proofErr w:type="spellEnd"/>
-      <w:r>
-        <w:t xml:space="preserve"> records; each </w:t>
-      </w:r>
-      <w:proofErr w:type="spellStart"/>
-      <w:r>
-        <w:t>EnrolledSubjects</w:t>
-      </w:r>
-      <w:proofErr w:type="spellEnd"/>
-      <w:r>
-        <w:t xml:space="preserve"> record must belong to exactly one Sections record (via </w:t>
-      </w:r>
-      <w:proofErr w:type="spellStart"/>
-      <w:r>
-        <w:t>EnrolledSubjects.sectionId</w:t>
-      </w:r>
-      <w:proofErr w:type="spellEnd"/>
-      <w:r>
-        <w:t>).</w:t>
-      </w:r>
+        <w:t>One Blocks record can have one or many EnrolledSubjects records; each EnrolledSubjects record must belong to exactly one Blocks record (via EnrolledSubjects.blockId).</w:t>
+      </w:r>
+      <w:proofErr w:type="spellStart"/>
+      <w:r/>
+      <w:proofErr w:type="spellEnd"/>
+      <w:r/>
+      <w:proofErr w:type="spellStart"/>
+      <w:r/>
+      <w:proofErr w:type="spellEnd"/>
+      <w:r/>
+      <w:proofErr w:type="spellStart"/>
+      <w:r/>
+      <w:proofErr w:type="spellEnd"/>
+      <w:r/>
     </w:p>
     <w:p>
       <w:pPr>
@@ -10200,16 +10080,12 @@
         <w:spacing w:after="100"/>
       </w:pPr>
       <w:r>
-        <w:t xml:space="preserve">One Sections record can have one or many Schedules records; each Schedules record must belong to exactly one Sections record (via </w:t>
-      </w:r>
-      <w:proofErr w:type="spellStart"/>
-      <w:r>
-        <w:t>Schedules.sectionId</w:t>
-      </w:r>
-      <w:proofErr w:type="spellEnd"/>
-      <w:r>
-        <w:t>).</w:t>
-      </w:r>
+        <w:t>One Blocks record can have one or many Schedules records; each Schedules record must belong to exactly one Blocks record (via Schedules.blockId).</w:t>
+      </w:r>
+      <w:proofErr w:type="spellStart"/>
+      <w:r/>
+      <w:proofErr w:type="spellEnd"/>
+      <w:r/>
     </w:p>
     <w:p>
       <w:pPr>
@@ -11005,6 +10881,22 @@
       <w:proofErr w:type="spellEnd"/>
       <w:r>
         <w:t>).</w:t>
+      </w:r>
+    </w:p>
+    <w:p>
+      <w:pPr>
+        <w:pStyle w:val="ListParagraph"/>
+      </w:pPr>
+      <w:r>
+        <w:t>One StaffUsers record can have zero, one, or many ClinicRecords records; each ClinicRecords record may belong to at most one StaffUsers record.</w:t>
+      </w:r>
+    </w:p>
+    <w:p>
+      <w:pPr>
+        <w:pStyle w:val="ListParagraph"/>
+      </w:pPr>
+      <w:r>
+        <w:t>One StaffUsers record can have zero, one, or many StudentClearances records; each StudentClearances record may belong to at most one StaffUsers record.</w:t>
       </w:r>
     </w:p>
     <w:p>
@@ -11082,7 +10974,7 @@
           <w:i/>
           <w:iCs/>
         </w:rPr>
-        <w:t>Total ERD relationship statements: 77</w:t>
+        <w:t>Total ERD relationship statements: 79</w:t>
       </w:r>
     </w:p>
     <w:sectPr>

</xml_diff>